<commit_message>
docs: integrar contenido completo de fase 4
</commit_message>
<xml_diff>
--- a/docs/ProyectoFases1a4_VetAgenda_integrado.docx
+++ b/docs/ProyectoFases1a4_VetAgenda_integrado.docx
@@ -5553,7 +5553,7 @@
         <w:rPr>
           <w:rFonts w:ascii="Aptos" w:hAnsi="Aptos"/>
         </w:rPr>
-        <w:t>4. Fase 4: integración frontend–backend y capa DAO</w:t>
+        <w:t>4. Fase 4: integración del entramado frontend–backend y fortalecimiento de la capa DAO</w:t>
       </w:r>
     </w:p>
     <w:p>
@@ -5564,16 +5564,49 @@
         <w:rPr>
           <w:rFonts w:ascii="Aptos" w:hAnsi="Aptos"/>
         </w:rPr>
-        <w:t>4.1 Propósito de la fase</w:t>
-      </w:r>
-    </w:p>
-    <w:p>
-      <w:r>
-        <w:rPr>
-          <w:rFonts w:ascii="Aptos" w:hAnsi="Aptos"/>
-          <w:sz w:val="21"/>
-        </w:rPr>
-        <w:t>La fase 4 fortalece la arquitectura de VetAgenda mediante una capa DAO (Data Access Object) que centraliza las consultas y operaciones CRUD. La retroalimentación docente señaló que las vistas accedían directamente al ORM y solicitó reorganizar la solución como View → DAO → ORM → base de datos. Las clases del 2 y 3 de septiembre también indicaron que el frontend debía consumir los servicios del backend, permitir la manipulación de estados y demostrar el flujo con pruebas de humo y de integración.</w:t>
+        <w:t>4.1 Resumen ejecutivo</w:t>
+      </w:r>
+    </w:p>
+    <w:p>
+      <w:r>
+        <w:rPr>
+          <w:rFonts w:ascii="Aptos" w:hAnsi="Aptos"/>
+          <w:sz w:val="21"/>
+        </w:rPr>
+        <w:t>La fase 4 fortalece la arquitectura de VetAgenda mediante una capa DAO (Data Access Object) real que centraliza las operaciones de persistencia. Antes de esta fase, las vistas consultaban y modificaban los modelos directamente con el ORM de Django. La retroalimentación docente indicó que la arquitectura debía reorganizarse como View → DAO → ORM → base de datos y que las pruebas debían demostrar que las operaciones CRUD pasan por esta capa.</w:t>
+      </w:r>
+    </w:p>
+    <w:p>
+      <w:r>
+        <w:rPr>
+          <w:rFonts w:ascii="Aptos" w:hAnsi="Aptos"/>
+          <w:sz w:val="21"/>
+        </w:rPr>
+        <w:t>La solución implementada crea cuatro objetos DAO, refactoriza todas las vistas, incorpora transiciones controladas para los estados de las citas, expone un endpoint REST de citas activas y amplía la suite a 18 pruebas automatizadas. Las clases del 2 y 3 de septiembre señalaron que la fase debía mostrar pruebas de humo, operaciones de la capa DAO, manipulación de estados desde el frontend, respuesta satisfactoria de los endpoints y evidencia del flujo completo.</w:t>
+      </w:r>
+    </w:p>
+    <w:p>
+      <w:pPr>
+        <w:pStyle w:val="Heading2"/>
+      </w:pPr>
+      <w:r>
+        <w:rPr>
+          <w:rFonts w:ascii="Aptos" w:hAnsi="Aptos"/>
+        </w:rPr>
+        <w:t>4.2 Retroalimentación docente atendida</w:t>
+      </w:r>
+    </w:p>
+    <w:p>
+      <w:pPr>
+        <w:ind w:left="504"/>
+      </w:pPr>
+      <w:r>
+        <w:rPr>
+          <w:rFonts w:ascii="Aptos" w:hAnsi="Aptos"/>
+          <w:i/>
+          <w:sz w:val="21"/>
+        </w:rPr>
+        <w:t>“Falta incorporar y utilizar una capa DAO que centralice estas operaciones, de manera que la arquitectura quede View → DAO → ORM → base de datos.”</w:t>
       </w:r>
     </w:p>
     <w:tbl>
@@ -5599,7 +5632,7 @@
               <w:rPr>
                 <w:b/>
               </w:rPr>
-              <w:t>Retroalimentación</w:t>
+              <w:t>Observación</w:t>
             </w:r>
           </w:p>
         </w:tc>
@@ -5614,7 +5647,7 @@
               <w:rPr>
                 <w:b/>
               </w:rPr>
-              <w:t>Mejora incorporada</w:t>
+              <w:t>Respuesta implementada</w:t>
             </w:r>
           </w:p>
         </w:tc>
@@ -5642,7 +5675,7 @@
           </w:tcPr>
           <w:p>
             <w:r>
-              <w:t>Acceso ORM directo desde views.py</w:t>
+              <w:t>Las vistas accedían directamente al ORM.</w:t>
             </w:r>
           </w:p>
         </w:tc>
@@ -5653,7 +5686,7 @@
           </w:tcPr>
           <w:p>
             <w:r>
-              <w:t>Se creó citas/dao.py y todas las vistas delegan la persistencia.</w:t>
+              <w:t>Se creó citas/dao.py y se eliminaron las consultas Modelo.objects de views.py.</w:t>
             </w:r>
           </w:p>
         </w:tc>
@@ -5664,6 +5697,41 @@
           </w:tcPr>
           <w:p>
             <w:r>
+              <w:t>citas/dao.py y citas/views.py.</w:t>
+            </w:r>
+          </w:p>
+        </w:tc>
+      </w:tr>
+      <w:tr>
+        <w:tc>
+          <w:tcPr>
+            <w:tcW w:type="dxa" w:w="3009"/>
+            <w:vAlign w:val="top"/>
+          </w:tcPr>
+          <w:p>
+            <w:r>
+              <w:t>Faltaba centralizar el CRUD.</w:t>
+            </w:r>
+          </w:p>
+        </w:tc>
+        <w:tc>
+          <w:tcPr>
+            <w:tcW w:type="dxa" w:w="3009"/>
+            <w:vAlign w:val="top"/>
+          </w:tcPr>
+          <w:p>
+            <w:r>
+              <w:t>Los DAO incluyen consultas, obtención por identificador, guardado y eliminación.</w:t>
+            </w:r>
+          </w:p>
+        </w:tc>
+        <w:tc>
+          <w:tcPr>
+            <w:tcW w:type="dxa" w:w="3009"/>
+            <w:vAlign w:val="top"/>
+          </w:tcPr>
+          <w:p>
+            <w:r>
               <w:t>PropietarioDAO, MascotaDAO, VeterinarioDAO y CitaDAO.</w:t>
             </w:r>
           </w:p>
@@ -5677,7 +5745,7 @@
           </w:tcPr>
           <w:p>
             <w:r>
-              <w:t>Faltaba demostrar CRUD por DAO</w:t>
+              <w:t>Era necesario demostrar el uso real del DAO.</w:t>
             </w:r>
           </w:p>
         </w:tc>
@@ -5688,7 +5756,7 @@
           </w:tcPr>
           <w:p>
             <w:r>
-              <w:t>Los DAO implementan listar, obtener, guardar y eliminar; CitaDAO agrega estados.</w:t>
+              <w:t>Se agregaron pruebas con mocks que comprueban que las vistas llaman a CitaDAO.listar() y CitaDAO.cambiar_estado().</w:t>
             </w:r>
           </w:p>
         </w:tc>
@@ -5699,7 +5767,7 @@
           </w:tcPr>
           <w:p>
             <w:r>
-              <w:t>Pruebas DAO y mocks en citas/tests.py.</w:t>
+              <w:t>CapaDAOTests en citas/tests.py.</w:t>
             </w:r>
           </w:p>
         </w:tc>
@@ -5712,7 +5780,7 @@
           </w:tcPr>
           <w:p>
             <w:r>
-              <w:t>Frontend sin flujo específico de estados</w:t>
+              <w:t>Debía existir evidencia del flujo completo.</w:t>
             </w:r>
           </w:p>
         </w:tc>
@@ -5723,7 +5791,7 @@
           </w:tcPr>
           <w:p>
             <w:r>
-              <w:t>La agenda permite confirmar, atender o cancelar mediante solicitudes POST.</w:t>
+              <w:t>La agenda permite confirmar, atender o cancelar citas mediante formularios POST.</w:t>
             </w:r>
           </w:p>
         </w:tc>
@@ -5734,42 +5802,7 @@
           </w:tcPr>
           <w:p>
             <w:r>
-              <w:t>/citas/ y /citas/hoy/.</w:t>
-            </w:r>
-          </w:p>
-        </w:tc>
-      </w:tr>
-      <w:tr>
-        <w:tc>
-          <w:tcPr>
-            <w:tcW w:type="dxa" w:w="3009"/>
-            <w:vAlign w:val="top"/>
-          </w:tcPr>
-          <w:p>
-            <w:r>
-              <w:t>Se requería evidencia del backend</w:t>
-            </w:r>
-          </w:p>
-        </w:tc>
-        <w:tc>
-          <w:tcPr>
-            <w:tcW w:type="dxa" w:w="3009"/>
-            <w:vAlign w:val="top"/>
-          </w:tcPr>
-          <w:p>
-            <w:r>
-              <w:t>Se agregó un endpoint JSON de citas activas.</w:t>
-            </w:r>
-          </w:p>
-        </w:tc>
-        <w:tc>
-          <w:tcPr>
-            <w:tcW w:type="dxa" w:w="3009"/>
-            <w:vAlign w:val="top"/>
-          </w:tcPr>
-          <w:p>
-            <w:r>
-              <w:t>GET /api/citas/activas/ responde HTTP 200.</w:t>
+              <w:t>/citas/hoy/ y capturas de la fase.</w:t>
             </w:r>
           </w:p>
         </w:tc>
@@ -5784,16 +5817,191 @@
         <w:rPr>
           <w:rFonts w:ascii="Aptos" w:hAnsi="Aptos"/>
         </w:rPr>
-        <w:t>4.2 Arquitectura implementada</w:t>
-      </w:r>
-    </w:p>
-    <w:p>
-      <w:r>
-        <w:rPr>
-          <w:rFonts w:ascii="Aptos" w:hAnsi="Aptos"/>
-          <w:sz w:val="21"/>
-        </w:rPr>
-        <w:t>Las plantillas y formularios envían solicitudes a las vistas. Las vistas coordinan la respuesta y llaman a la capa DAO. Únicamente los DAO utilizan el ORM de Django para consultar o modificar la base de datos. De esta manera, la interfaz queda desacoplada de la persistencia.</w:t>
+        <w:t>4.3 Objetivo y alcance de la fase 4</w:t>
+      </w:r>
+    </w:p>
+    <w:p>
+      <w:r>
+        <w:rPr>
+          <w:rFonts w:ascii="Aptos" w:hAnsi="Aptos"/>
+          <w:sz w:val="21"/>
+        </w:rPr>
+        <w:t>El objetivo de esta fase es integrar el frontend con los servicios y objetos del backend para que el usuario manipule datos sin que las vistas dependan directamente de la persistencia. La docente explicó que las pruebas deben adaptarse a los modelos de cada proyecto y pueden abarcar creación de objetos, relaciones, validaciones, DAO, roles y endpoints JSON. La clase siguiente completó el flujo con métodos DAO para obtener registros activos y cambiar estados, así como pruebas que validan la capa de datos, el flujo web y la API.</w:t>
+      </w:r>
+    </w:p>
+    <w:tbl>
+      <w:tblPr>
+        <w:tblW w:type="auto" w:w="0"/>
+        <w:jc w:val="center"/>
+        <w:tblLook w:firstColumn="1" w:firstRow="1" w:lastColumn="0" w:lastRow="0" w:noHBand="0" w:noVBand="1" w:val="04A0"/>
+      </w:tblPr>
+      <w:tblGrid>
+        <w:gridCol w:w="4513"/>
+        <w:gridCol w:w="4513"/>
+      </w:tblGrid>
+      <w:tr>
+        <w:tc>
+          <w:tcPr>
+            <w:tcW w:type="dxa" w:w="4513"/>
+            <w:shd w:fill="DDEBF7"/>
+            <w:vAlign w:val="center"/>
+          </w:tcPr>
+          <w:p>
+            <w:r>
+              <w:rPr>
+                <w:b/>
+              </w:rPr>
+              <w:t>Incluido en la fase 4</w:t>
+            </w:r>
+          </w:p>
+        </w:tc>
+        <w:tc>
+          <w:tcPr>
+            <w:tcW w:type="dxa" w:w="4513"/>
+            <w:shd w:fill="DDEBF7"/>
+            <w:vAlign w:val="center"/>
+          </w:tcPr>
+          <w:p>
+            <w:r>
+              <w:rPr>
+                <w:b/>
+              </w:rPr>
+              <w:t>Reservado para fases posteriores</w:t>
+            </w:r>
+          </w:p>
+        </w:tc>
+      </w:tr>
+      <w:tr>
+        <w:tc>
+          <w:tcPr>
+            <w:tcW w:type="dxa" w:w="4513"/>
+            <w:vAlign w:val="top"/>
+          </w:tcPr>
+          <w:p>
+            <w:r>
+              <w:t>Capa DAO real para las cuatro entidades.</w:t>
+            </w:r>
+          </w:p>
+        </w:tc>
+        <w:tc>
+          <w:tcPr>
+            <w:tcW w:type="dxa" w:w="4513"/>
+            <w:vAlign w:val="top"/>
+          </w:tcPr>
+          <w:p>
+            <w:r>
+              <w:t>Despliegue productivo en un servidor externo.</w:t>
+            </w:r>
+          </w:p>
+        </w:tc>
+      </w:tr>
+      <w:tr>
+        <w:tc>
+          <w:tcPr>
+            <w:tcW w:type="dxa" w:w="4513"/>
+            <w:vAlign w:val="top"/>
+          </w:tcPr>
+          <w:p>
+            <w:r>
+              <w:t>Refactorización completa de vistas.</w:t>
+            </w:r>
+          </w:p>
+        </w:tc>
+        <w:tc>
+          <w:tcPr>
+            <w:tcW w:type="dxa" w:w="4513"/>
+            <w:vAlign w:val="top"/>
+          </w:tcPr>
+          <w:p>
+            <w:r>
+              <w:t>Notificaciones por correo o mensajería.</w:t>
+            </w:r>
+          </w:p>
+        </w:tc>
+      </w:tr>
+      <w:tr>
+        <w:tc>
+          <w:tcPr>
+            <w:tcW w:type="dxa" w:w="4513"/>
+            <w:vAlign w:val="top"/>
+          </w:tcPr>
+          <w:p>
+            <w:r>
+              <w:t>Cambio de estado desde el frontend.</w:t>
+            </w:r>
+          </w:p>
+        </w:tc>
+        <w:tc>
+          <w:tcPr>
+            <w:tcW w:type="dxa" w:w="4513"/>
+            <w:vAlign w:val="top"/>
+          </w:tcPr>
+          <w:p>
+            <w:r>
+              <w:t>Historial clínico avanzado y archivos médicos.</w:t>
+            </w:r>
+          </w:p>
+        </w:tc>
+      </w:tr>
+      <w:tr>
+        <w:tc>
+          <w:tcPr>
+            <w:tcW w:type="dxa" w:w="4513"/>
+            <w:vAlign w:val="top"/>
+          </w:tcPr>
+          <w:p>
+            <w:r>
+              <w:t>Endpoint REST de citas activas.</w:t>
+            </w:r>
+          </w:p>
+        </w:tc>
+        <w:tc>
+          <w:tcPr>
+            <w:tcW w:type="dxa" w:w="4513"/>
+            <w:vAlign w:val="top"/>
+          </w:tcPr>
+          <w:p>
+            <w:r>
+              <w:t>Aplicación móvil o consumo por terceros.</w:t>
+            </w:r>
+          </w:p>
+        </w:tc>
+      </w:tr>
+      <w:tr>
+        <w:tc>
+          <w:tcPr>
+            <w:tcW w:type="dxa" w:w="4513"/>
+            <w:vAlign w:val="top"/>
+          </w:tcPr>
+          <w:p>
+            <w:r>
+              <w:t>Pruebas de DAO, vistas, modelos y API.</w:t>
+            </w:r>
+          </w:p>
+        </w:tc>
+        <w:tc>
+          <w:tcPr>
+            <w:tcW w:type="dxa" w:w="4513"/>
+            <w:vAlign w:val="top"/>
+          </w:tcPr>
+          <w:p>
+            <w:r>
+              <w:t>Seguridad productiva y auditoría clínica.</w:t>
+            </w:r>
+          </w:p>
+        </w:tc>
+      </w:tr>
+    </w:tbl>
+    <w:p/>
+    <w:p>
+      <w:pPr>
+        <w:pStyle w:val="Heading2"/>
+      </w:pPr>
+      <w:r>
+        <w:rPr>
+          <w:rFonts w:ascii="Aptos" w:hAnsi="Aptos"/>
+        </w:rPr>
+        <w:t>4.4 Arquitectura implementada</w:t>
       </w:r>
     </w:p>
     <w:p>
@@ -5853,6 +6061,15 @@
         <w:t>Figura 1. Arquitectura View → DAO → ORM → base de datos.</w:t>
       </w:r>
     </w:p>
+    <w:p>
+      <w:r>
+        <w:rPr>
+          <w:rFonts w:ascii="Aptos" w:hAnsi="Aptos"/>
+          <w:sz w:val="21"/>
+        </w:rPr>
+        <w:t>La capa DAO actúa como frontera entre la lógica de interacción y el ORM. Las vistas reciben solicitudes HTTP, validan los formularios y delegan la lectura o escritura al DAO. El DAO utiliza el ORM de Django, que finalmente genera las operaciones sobre SQLite. Las vistas de API construyen respuestas HTTP estructuradas para los datos solicitados.</w:t>
+      </w:r>
+    </w:p>
     <w:tbl>
       <w:tblPr>
         <w:tblW w:type="auto" w:w="0"/>
@@ -5891,7 +6108,7 @@
               <w:rPr>
                 <w:b/>
               </w:rPr>
-              <w:t>Archivos</w:t>
+              <w:t>Archivos principales</w:t>
             </w:r>
           </w:p>
         </w:tc>
@@ -5965,7 +6182,7 @@
           </w:tcPr>
           <w:p>
             <w:r>
-              <w:t>views.py y api_views.py</w:t>
+              <w:t>citas/views.py y citas/api_views.py</w:t>
             </w:r>
           </w:p>
         </w:tc>
@@ -5976,7 +6193,7 @@
           </w:tcPr>
           <w:p>
             <w:r>
-              <w:t>Recibir solicitudes y coordinar respuestas sin consultas directas al ORM.</w:t>
+              <w:t>Recibir solicitudes y coordinar la respuesta sin consultar directamente el ORM.</w:t>
             </w:r>
           </w:p>
         </w:tc>
@@ -6000,7 +6217,7 @@
           </w:tcPr>
           <w:p>
             <w:r>
-              <w:t>dao.py</w:t>
+              <w:t>citas/dao.py</w:t>
             </w:r>
           </w:p>
         </w:tc>
@@ -6011,7 +6228,7 @@
           </w:tcPr>
           <w:p>
             <w:r>
-              <w:t>Centralizar búsquedas, conteos, CRUD, agenda y transiciones de estado.</w:t>
+              <w:t>Centralizar búsquedas, conteos, CRUD, agenda, resumen y transiciones de estado.</w:t>
             </w:r>
           </w:p>
         </w:tc>
@@ -6035,7 +6252,7 @@
           </w:tcPr>
           <w:p>
             <w:r>
-              <w:t>models.py y migrations/</w:t>
+              <w:t>citas/models.py y citas/migrations/</w:t>
             </w:r>
           </w:p>
         </w:tc>
@@ -6046,7 +6263,7 @@
           </w:tcPr>
           <w:p>
             <w:r>
-              <w:t>Aplicar relaciones, restricciones y validaciones.</w:t>
+              <w:t>Mapear entidades, relaciones, validaciones y restricciones.</w:t>
             </w:r>
           </w:p>
         </w:tc>
@@ -6070,7 +6287,7 @@
           </w:tcPr>
           <w:p>
             <w:r>
-              <w:t>SQLite local</w:t>
+              <w:t>db.sqlite3 local</w:t>
             </w:r>
           </w:p>
         </w:tc>
@@ -6090,13 +6307,329 @@
     <w:p/>
     <w:p>
       <w:pPr>
+        <w:pStyle w:val="Heading3"/>
+      </w:pPr>
+      <w:r>
+        <w:rPr>
+          <w:rFonts w:ascii="Aptos" w:hAnsi="Aptos"/>
+        </w:rPr>
+        <w:t>4.4.1 Comparación antes y después</w:t>
+      </w:r>
+    </w:p>
+    <w:tbl>
+      <w:tblPr>
+        <w:tblW w:type="auto" w:w="0"/>
+        <w:jc w:val="center"/>
+        <w:tblLook w:firstColumn="1" w:firstRow="1" w:lastColumn="0" w:lastRow="0" w:noHBand="0" w:noVBand="1" w:val="04A0"/>
+      </w:tblPr>
+      <w:tblGrid>
+        <w:gridCol w:w="3009"/>
+        <w:gridCol w:w="3009"/>
+        <w:gridCol w:w="3009"/>
+      </w:tblGrid>
+      <w:tr>
+        <w:tc>
+          <w:tcPr>
+            <w:tcW w:type="dxa" w:w="3009"/>
+            <w:shd w:fill="DDEBF7"/>
+            <w:vAlign w:val="center"/>
+          </w:tcPr>
+          <w:p>
+            <w:r>
+              <w:rPr>
+                <w:b/>
+              </w:rPr>
+              <w:t>Aspecto</w:t>
+            </w:r>
+          </w:p>
+        </w:tc>
+        <w:tc>
+          <w:tcPr>
+            <w:tcW w:type="dxa" w:w="3009"/>
+            <w:shd w:fill="DDEBF7"/>
+            <w:vAlign w:val="center"/>
+          </w:tcPr>
+          <w:p>
+            <w:r>
+              <w:rPr>
+                <w:b/>
+              </w:rPr>
+              <w:t>Antes de la fase 4</w:t>
+            </w:r>
+          </w:p>
+        </w:tc>
+        <w:tc>
+          <w:tcPr>
+            <w:tcW w:type="dxa" w:w="3009"/>
+            <w:shd w:fill="DDEBF7"/>
+            <w:vAlign w:val="center"/>
+          </w:tcPr>
+          <w:p>
+            <w:r>
+              <w:rPr>
+                <w:b/>
+              </w:rPr>
+              <w:t>Después de la fase 4</w:t>
+            </w:r>
+          </w:p>
+        </w:tc>
+      </w:tr>
+      <w:tr>
+        <w:tc>
+          <w:tcPr>
+            <w:tcW w:type="dxa" w:w="3009"/>
+            <w:vAlign w:val="top"/>
+          </w:tcPr>
+          <w:p>
+            <w:r>
+              <w:t>Consulta de propietarios</w:t>
+            </w:r>
+          </w:p>
+        </w:tc>
+        <w:tc>
+          <w:tcPr>
+            <w:tcW w:type="dxa" w:w="3009"/>
+            <w:vAlign w:val="top"/>
+          </w:tcPr>
+          <w:p>
+            <w:r>
+              <w:t>Propietario.objects en la vista.</w:t>
+            </w:r>
+          </w:p>
+        </w:tc>
+        <w:tc>
+          <w:tcPr>
+            <w:tcW w:type="dxa" w:w="3009"/>
+            <w:vAlign w:val="top"/>
+          </w:tcPr>
+          <w:p>
+            <w:r>
+              <w:t>PropietarioDAO.listar() en la vista.</w:t>
+            </w:r>
+          </w:p>
+        </w:tc>
+      </w:tr>
+      <w:tr>
+        <w:tc>
+          <w:tcPr>
+            <w:tcW w:type="dxa" w:w="3009"/>
+            <w:vAlign w:val="top"/>
+          </w:tcPr>
+          <w:p>
+            <w:r>
+              <w:t>Consulta de mascotas</w:t>
+            </w:r>
+          </w:p>
+        </w:tc>
+        <w:tc>
+          <w:tcPr>
+            <w:tcW w:type="dxa" w:w="3009"/>
+            <w:vAlign w:val="top"/>
+          </w:tcPr>
+          <w:p>
+            <w:r>
+              <w:t>Mascota.objects en la vista.</w:t>
+            </w:r>
+          </w:p>
+        </w:tc>
+        <w:tc>
+          <w:tcPr>
+            <w:tcW w:type="dxa" w:w="3009"/>
+            <w:vAlign w:val="top"/>
+          </w:tcPr>
+          <w:p>
+            <w:r>
+              <w:t>MascotaDAO.listar() en la vista.</w:t>
+            </w:r>
+          </w:p>
+        </w:tc>
+      </w:tr>
+      <w:tr>
+        <w:tc>
+          <w:tcPr>
+            <w:tcW w:type="dxa" w:w="3009"/>
+            <w:vAlign w:val="top"/>
+          </w:tcPr>
+          <w:p>
+            <w:r>
+              <w:t>Consulta de veterinarios</w:t>
+            </w:r>
+          </w:p>
+        </w:tc>
+        <w:tc>
+          <w:tcPr>
+            <w:tcW w:type="dxa" w:w="3009"/>
+            <w:vAlign w:val="top"/>
+          </w:tcPr>
+          <w:p>
+            <w:r>
+              <w:t>Veterinario.objects en la vista.</w:t>
+            </w:r>
+          </w:p>
+        </w:tc>
+        <w:tc>
+          <w:tcPr>
+            <w:tcW w:type="dxa" w:w="3009"/>
+            <w:vAlign w:val="top"/>
+          </w:tcPr>
+          <w:p>
+            <w:r>
+              <w:t>VeterinarioDAO.listar() y listar_activos().</w:t>
+            </w:r>
+          </w:p>
+        </w:tc>
+      </w:tr>
+      <w:tr>
+        <w:tc>
+          <w:tcPr>
+            <w:tcW w:type="dxa" w:w="3009"/>
+            <w:vAlign w:val="top"/>
+          </w:tcPr>
+          <w:p>
+            <w:r>
+              <w:t>Consulta de citas</w:t>
+            </w:r>
+          </w:p>
+        </w:tc>
+        <w:tc>
+          <w:tcPr>
+            <w:tcW w:type="dxa" w:w="3009"/>
+            <w:vAlign w:val="top"/>
+          </w:tcPr>
+          <w:p>
+            <w:r>
+              <w:t>Cita.objects en la vista.</w:t>
+            </w:r>
+          </w:p>
+        </w:tc>
+        <w:tc>
+          <w:tcPr>
+            <w:tcW w:type="dxa" w:w="3009"/>
+            <w:vAlign w:val="top"/>
+          </w:tcPr>
+          <w:p>
+            <w:r>
+              <w:t>CitaDAO.listar(), listar_hoy() y listar_activas().</w:t>
+            </w:r>
+          </w:p>
+        </w:tc>
+      </w:tr>
+      <w:tr>
+        <w:tc>
+          <w:tcPr>
+            <w:tcW w:type="dxa" w:w="3009"/>
+            <w:vAlign w:val="top"/>
+          </w:tcPr>
+          <w:p>
+            <w:r>
+              <w:t>Guardado</w:t>
+            </w:r>
+          </w:p>
+        </w:tc>
+        <w:tc>
+          <w:tcPr>
+            <w:tcW w:type="dxa" w:w="3009"/>
+            <w:vAlign w:val="top"/>
+          </w:tcPr>
+          <w:p>
+            <w:r>
+              <w:t>form.save() desde la vista.</w:t>
+            </w:r>
+          </w:p>
+        </w:tc>
+        <w:tc>
+          <w:tcPr>
+            <w:tcW w:type="dxa" w:w="3009"/>
+            <w:vAlign w:val="top"/>
+          </w:tcPr>
+          <w:p>
+            <w:r>
+              <w:t>DAO.guardar(form.save(commit=False)).</w:t>
+            </w:r>
+          </w:p>
+        </w:tc>
+      </w:tr>
+      <w:tr>
+        <w:tc>
+          <w:tcPr>
+            <w:tcW w:type="dxa" w:w="3009"/>
+            <w:vAlign w:val="top"/>
+          </w:tcPr>
+          <w:p>
+            <w:r>
+              <w:t>Eliminación</w:t>
+            </w:r>
+          </w:p>
+        </w:tc>
+        <w:tc>
+          <w:tcPr>
+            <w:tcW w:type="dxa" w:w="3009"/>
+            <w:vAlign w:val="top"/>
+          </w:tcPr>
+          <w:p>
+            <w:r>
+              <w:t>registro.delete() desde la vista.</w:t>
+            </w:r>
+          </w:p>
+        </w:tc>
+        <w:tc>
+          <w:tcPr>
+            <w:tcW w:type="dxa" w:w="3009"/>
+            <w:vAlign w:val="top"/>
+          </w:tcPr>
+          <w:p>
+            <w:r>
+              <w:t>DAO.eliminar(registro).</w:t>
+            </w:r>
+          </w:p>
+        </w:tc>
+      </w:tr>
+      <w:tr>
+        <w:tc>
+          <w:tcPr>
+            <w:tcW w:type="dxa" w:w="3009"/>
+            <w:vAlign w:val="top"/>
+          </w:tcPr>
+          <w:p>
+            <w:r>
+              <w:t>Cambio de estado</w:t>
+            </w:r>
+          </w:p>
+        </w:tc>
+        <w:tc>
+          <w:tcPr>
+            <w:tcW w:type="dxa" w:w="3009"/>
+            <w:vAlign w:val="top"/>
+          </w:tcPr>
+          <w:p>
+            <w:r>
+              <w:t>Edición general del formulario.</w:t>
+            </w:r>
+          </w:p>
+        </w:tc>
+        <w:tc>
+          <w:tcPr>
+            <w:tcW w:type="dxa" w:w="3009"/>
+            <w:vAlign w:val="top"/>
+          </w:tcPr>
+          <w:p>
+            <w:r>
+              <w:t>CitaDAO.cambiar_estado() con reglas de transición.</w:t>
+            </w:r>
+          </w:p>
+        </w:tc>
+      </w:tr>
+    </w:tbl>
+    <w:p/>
+    <w:p>
+      <w:pPr>
         <w:pStyle w:val="Heading2"/>
       </w:pPr>
       <w:r>
         <w:rPr>
           <w:rFonts w:ascii="Aptos" w:hAnsi="Aptos"/>
         </w:rPr>
-        <w:t>4.3 Objetos DAO y operaciones</w:t>
+        <w:t>4.5 Diseño de la capa DAO</w:t>
       </w:r>
     </w:p>
     <w:tbl>
@@ -6136,7 +6669,7 @@
               <w:rPr>
                 <w:b/>
               </w:rPr>
-              <w:t>Operaciones principales</w:t>
+              <w:t>Consultas y operaciones implementadas</w:t>
             </w:r>
           </w:p>
         </w:tc>
@@ -6184,7 +6717,7 @@
           </w:tcPr>
           <w:p>
             <w:r>
-              <w:t>contar, listar con relaciones, obtener_por_id, guardar y eliminar.</w:t>
+              <w:t>contar, listar con propietario y total de citas, obtener_por_id, guardar y eliminar.</w:t>
             </w:r>
           </w:p>
         </w:tc>
@@ -6245,7 +6778,7 @@
           <w:rFonts w:ascii="Aptos" w:hAnsi="Aptos"/>
           <w:sz w:val="21"/>
         </w:rPr>
-        <w:t>Los métodos guardar ejecutan full_clean() antes de persistir el objeto, por lo que se mantienen las validaciones del modelo. Las vistas ya no contienen llamadas Modelo.objects, y los formularios se guardan con commit=False antes de entregarse al DAO.</w:t>
+        <w:t>Los métodos guardar llaman a full_clean() antes de persistir el objeto, por lo que las validaciones del modelo —incluido el control de solapamientos— siguen siendo obligatorias. Las vistas reciben objetos o conjuntos de resultados preparados por el DAO y no contienen llamadas Modelo.objects.</w:t>
       </w:r>
     </w:p>
     <w:p>
@@ -6256,16 +6789,16 @@
         <w:rPr>
           <w:rFonts w:ascii="Aptos" w:hAnsi="Aptos"/>
         </w:rPr>
-        <w:t>4.4 Integración del frontend con el backend</w:t>
-      </w:r>
-    </w:p>
-    <w:p>
-      <w:r>
-        <w:rPr>
-          <w:rFonts w:ascii="Aptos" w:hAnsi="Aptos"/>
-          <w:sz w:val="21"/>
-        </w:rPr>
-        <w:t>La agenda diaria muestra los registros obtenidos mediante CitaDAO.listar_hoy(). Según el estado actual, la interfaz presenta únicamente las transiciones permitidas. Cada acción utiliza POST y un token CSRF. La vista cita_cambiar_estado recibe la solicitud y llama a CitaDAO.cambiar_estado(), que valida la transición y actualiza la base de datos.</w:t>
+        <w:t>4.6 Reglas de transición de las citas</w:t>
+      </w:r>
+    </w:p>
+    <w:p>
+      <w:r>
+        <w:rPr>
+          <w:rFonts w:ascii="Aptos" w:hAnsi="Aptos"/>
+          <w:sz w:val="21"/>
+        </w:rPr>
+        <w:t>La manipulación de estados se limita a transiciones coherentes. El backend rechaza estados desconocidos y cambios no permitidos.</w:t>
       </w:r>
     </w:p>
     <w:tbl>
@@ -6275,13 +6808,14 @@
         <w:tblLook w:firstColumn="1" w:firstRow="1" w:lastColumn="0" w:lastRow="0" w:noHBand="0" w:noVBand="1" w:val="04A0"/>
       </w:tblPr>
       <w:tblGrid>
-        <w:gridCol w:w="4513"/>
-        <w:gridCol w:w="4513"/>
+        <w:gridCol w:w="3009"/>
+        <w:gridCol w:w="3009"/>
+        <w:gridCol w:w="3009"/>
       </w:tblGrid>
       <w:tr>
         <w:tc>
           <w:tcPr>
-            <w:tcW w:type="dxa" w:w="4513"/>
+            <w:tcW w:type="dxa" w:w="3009"/>
             <w:shd w:fill="DDEBF7"/>
             <w:vAlign w:val="center"/>
           </w:tcPr>
@@ -6296,7 +6830,7 @@
         </w:tc>
         <w:tc>
           <w:tcPr>
-            <w:tcW w:type="dxa" w:w="4513"/>
+            <w:tcW w:type="dxa" w:w="3009"/>
             <w:shd w:fill="DDEBF7"/>
             <w:vAlign w:val="center"/>
           </w:tcPr>
@@ -6305,15 +6839,30 @@
               <w:rPr>
                 <w:b/>
               </w:rPr>
-              <w:t>Transiciones permitidas</w:t>
-            </w:r>
-          </w:p>
-        </w:tc>
-      </w:tr>
-      <w:tr>
-        <w:tc>
-          <w:tcPr>
-            <w:tcW w:type="dxa" w:w="4513"/>
+              <w:t>Estados permitidos</w:t>
+            </w:r>
+          </w:p>
+        </w:tc>
+        <w:tc>
+          <w:tcPr>
+            <w:tcW w:type="dxa" w:w="3009"/>
+            <w:shd w:fill="DDEBF7"/>
+            <w:vAlign w:val="center"/>
+          </w:tcPr>
+          <w:p>
+            <w:r>
+              <w:rPr>
+                <w:b/>
+              </w:rPr>
+              <w:t>Resultado visual</w:t>
+            </w:r>
+          </w:p>
+        </w:tc>
+      </w:tr>
+      <w:tr>
+        <w:tc>
+          <w:tcPr>
+            <w:tcW w:type="dxa" w:w="3009"/>
             <w:vAlign w:val="top"/>
           </w:tcPr>
           <w:p>
@@ -6324,7 +6873,7 @@
         </w:tc>
         <w:tc>
           <w:tcPr>
-            <w:tcW w:type="dxa" w:w="4513"/>
+            <w:tcW w:type="dxa" w:w="3009"/>
             <w:vAlign w:val="top"/>
           </w:tcPr>
           <w:p>
@@ -6333,11 +6882,22 @@
             </w:r>
           </w:p>
         </w:tc>
-      </w:tr>
-      <w:tr>
-        <w:tc>
-          <w:tcPr>
-            <w:tcW w:type="dxa" w:w="4513"/>
+        <w:tc>
+          <w:tcPr>
+            <w:tcW w:type="dxa" w:w="3009"/>
+            <w:vAlign w:val="top"/>
+          </w:tcPr>
+          <w:p>
+            <w:r>
+              <w:t>Botones Confirmar y Cancelar.</w:t>
+            </w:r>
+          </w:p>
+        </w:tc>
+      </w:tr>
+      <w:tr>
+        <w:tc>
+          <w:tcPr>
+            <w:tcW w:type="dxa" w:w="3009"/>
             <w:vAlign w:val="top"/>
           </w:tcPr>
           <w:p>
@@ -6348,7 +6908,7 @@
         </w:tc>
         <w:tc>
           <w:tcPr>
-            <w:tcW w:type="dxa" w:w="4513"/>
+            <w:tcW w:type="dxa" w:w="3009"/>
             <w:vAlign w:val="top"/>
           </w:tcPr>
           <w:p>
@@ -6357,11 +6917,22 @@
             </w:r>
           </w:p>
         </w:tc>
-      </w:tr>
-      <w:tr>
-        <w:tc>
-          <w:tcPr>
-            <w:tcW w:type="dxa" w:w="4513"/>
+        <w:tc>
+          <w:tcPr>
+            <w:tcW w:type="dxa" w:w="3009"/>
+            <w:vAlign w:val="top"/>
+          </w:tcPr>
+          <w:p>
+            <w:r>
+              <w:t>Botones Marcar atendida y Cancelar.</w:t>
+            </w:r>
+          </w:p>
+        </w:tc>
+      </w:tr>
+      <w:tr>
+        <w:tc>
+          <w:tcPr>
+            <w:tcW w:type="dxa" w:w="3009"/>
             <w:vAlign w:val="top"/>
           </w:tcPr>
           <w:p>
@@ -6372,20 +6943,31 @@
         </w:tc>
         <w:tc>
           <w:tcPr>
-            <w:tcW w:type="dxa" w:w="4513"/>
-            <w:vAlign w:val="top"/>
-          </w:tcPr>
-          <w:p>
-            <w:r>
-              <w:t>Sin cambios posteriores.</w:t>
-            </w:r>
-          </w:p>
-        </w:tc>
-      </w:tr>
-      <w:tr>
-        <w:tc>
-          <w:tcPr>
-            <w:tcW w:type="dxa" w:w="4513"/>
+            <w:tcW w:type="dxa" w:w="3009"/>
+            <w:vAlign w:val="top"/>
+          </w:tcPr>
+          <w:p>
+            <w:r>
+              <w:t>Ninguno.</w:t>
+            </w:r>
+          </w:p>
+        </w:tc>
+        <w:tc>
+          <w:tcPr>
+            <w:tcW w:type="dxa" w:w="3009"/>
+            <w:vAlign w:val="top"/>
+          </w:tcPr>
+          <w:p>
+            <w:r>
+              <w:t>Texto “Sin cambios disponibles”.</w:t>
+            </w:r>
+          </w:p>
+        </w:tc>
+      </w:tr>
+      <w:tr>
+        <w:tc>
+          <w:tcPr>
+            <w:tcW w:type="dxa" w:w="3009"/>
             <w:vAlign w:val="top"/>
           </w:tcPr>
           <w:p>
@@ -6396,18 +6978,443 @@
         </w:tc>
         <w:tc>
           <w:tcPr>
-            <w:tcW w:type="dxa" w:w="4513"/>
-            <w:vAlign w:val="top"/>
-          </w:tcPr>
-          <w:p>
-            <w:r>
-              <w:t>Sin cambios posteriores.</w:t>
+            <w:tcW w:type="dxa" w:w="3009"/>
+            <w:vAlign w:val="top"/>
+          </w:tcPr>
+          <w:p>
+            <w:r>
+              <w:t>Ninguno.</w:t>
+            </w:r>
+          </w:p>
+        </w:tc>
+        <w:tc>
+          <w:tcPr>
+            <w:tcW w:type="dxa" w:w="3009"/>
+            <w:vAlign w:val="top"/>
+          </w:tcPr>
+          <w:p>
+            <w:r>
+              <w:t>Texto “Sin cambios disponibles”.</w:t>
             </w:r>
           </w:p>
         </w:tc>
       </w:tr>
     </w:tbl>
     <w:p/>
+    <w:p>
+      <w:r>
+        <w:rPr>
+          <w:rFonts w:ascii="Aptos" w:hAnsi="Aptos"/>
+          <w:sz w:val="21"/>
+        </w:rPr>
+        <w:t>El formulario de estado utiliza el método HTTP POST e incluye el token CSRF de Django. La vista cita_cambiar_estado recibe la solicitud, llama a CitaDAO.cambiar_estado() y devuelve un mensaje de éxito o error.</w:t>
+      </w:r>
+    </w:p>
+    <w:p>
+      <w:pPr>
+        <w:pStyle w:val="Heading2"/>
+      </w:pPr>
+      <w:r>
+        <w:rPr>
+          <w:rFonts w:ascii="Aptos" w:hAnsi="Aptos"/>
+        </w:rPr>
+        <w:t>4.7 Endpoint REST</w:t>
+      </w:r>
+    </w:p>
+    <w:p>
+      <w:r>
+        <w:rPr>
+          <w:rFonts w:ascii="Aptos" w:hAnsi="Aptos"/>
+          <w:sz w:val="21"/>
+        </w:rPr>
+        <w:t>Se incorporó el endpoint de solo lectura GET /api/citas/activas/.</w:t>
+      </w:r>
+    </w:p>
+    <w:p>
+      <w:r>
+        <w:rPr>
+          <w:rFonts w:ascii="Aptos" w:hAnsi="Aptos"/>
+          <w:sz w:val="21"/>
+        </w:rPr>
+        <w:t>CitasActivasAPIView solicita los registros a CitaDAO.listar_activas() y CitaSerializer los transforma a JSON. Solo se devuelven citas con estado solicitada o confirmada. La respuesta incluye paciente, propietario, veterinario, fecha, hora inicial, hora final, duración, motivo y estado.</w:t>
+      </w:r>
+    </w:p>
+    <w:p>
+      <w:pPr>
+        <w:ind w:left="504" w:right="504"/>
+      </w:pPr>
+      <w:r>
+        <w:rPr>
+          <w:rFonts w:ascii="Courier New" w:hAnsi="Courier New"/>
+          <w:sz w:val="18"/>
+        </w:rPr>
+        <w:t>{</w:t>
+        <w:br/>
+      </w:r>
+      <w:r>
+        <w:rPr>
+          <w:rFonts w:ascii="Courier New" w:hAnsi="Courier New"/>
+          <w:sz w:val="18"/>
+        </w:rPr>
+        <w:t xml:space="preserve">  "mascota_nombre": "Max",</w:t>
+        <w:br/>
+      </w:r>
+      <w:r>
+        <w:rPr>
+          <w:rFonts w:ascii="Courier New" w:hAnsi="Courier New"/>
+          <w:sz w:val="18"/>
+        </w:rPr>
+        <w:t xml:space="preserve">  "propietario_nombre": "Mario Hernández",</w:t>
+        <w:br/>
+      </w:r>
+      <w:r>
+        <w:rPr>
+          <w:rFonts w:ascii="Courier New" w:hAnsi="Courier New"/>
+          <w:sz w:val="18"/>
+        </w:rPr>
+        <w:t xml:space="preserve">  "veterinario_nombre": "Dr. Diego Ramírez",</w:t>
+        <w:br/>
+      </w:r>
+      <w:r>
+        <w:rPr>
+          <w:rFonts w:ascii="Courier New" w:hAnsi="Courier New"/>
+          <w:sz w:val="18"/>
+        </w:rPr>
+        <w:t xml:space="preserve">  "estado": "solicitada",</w:t>
+        <w:br/>
+      </w:r>
+      <w:r>
+        <w:rPr>
+          <w:rFonts w:ascii="Courier New" w:hAnsi="Courier New"/>
+          <w:sz w:val="18"/>
+        </w:rPr>
+        <w:t xml:space="preserve">  "estado_etiqueta": "Solicitada"</w:t>
+        <w:br/>
+      </w:r>
+      <w:r>
+        <w:rPr>
+          <w:rFonts w:ascii="Courier New" w:hAnsi="Courier New"/>
+          <w:sz w:val="18"/>
+        </w:rPr>
+        <w:t>}</w:t>
+        <w:br/>
+      </w:r>
+    </w:p>
+    <w:p>
+      <w:pPr>
+        <w:pStyle w:val="Heading2"/>
+      </w:pPr>
+      <w:r>
+        <w:rPr>
+          <w:rFonts w:ascii="Aptos" w:hAnsi="Aptos"/>
+        </w:rPr>
+        <w:t>4.8 Pruebas de humo y de integración</w:t>
+      </w:r>
+    </w:p>
+    <w:p>
+      <w:r>
+        <w:rPr>
+          <w:rFonts w:ascii="Aptos" w:hAnsi="Aptos"/>
+          <w:sz w:val="21"/>
+        </w:rPr>
+        <w:t>La suite final contiene 18 pruebas. Se ejecutó con una base de datos temporal e independiente; todas finalizaron correctamente.</w:t>
+      </w:r>
+    </w:p>
+    <w:tbl>
+      <w:tblPr>
+        <w:tblW w:type="auto" w:w="0"/>
+        <w:jc w:val="center"/>
+        <w:tblLook w:firstColumn="1" w:firstRow="1" w:lastColumn="0" w:lastRow="0" w:noHBand="0" w:noVBand="1" w:val="04A0"/>
+      </w:tblPr>
+      <w:tblGrid>
+        <w:gridCol w:w="3009"/>
+        <w:gridCol w:w="3009"/>
+        <w:gridCol w:w="3009"/>
+      </w:tblGrid>
+      <w:tr>
+        <w:tc>
+          <w:tcPr>
+            <w:tcW w:type="dxa" w:w="3009"/>
+            <w:shd w:fill="DDEBF7"/>
+            <w:vAlign w:val="center"/>
+          </w:tcPr>
+          <w:p>
+            <w:r>
+              <w:rPr>
+                <w:b/>
+              </w:rPr>
+              <w:t>Grupo</w:t>
+            </w:r>
+          </w:p>
+        </w:tc>
+        <w:tc>
+          <w:tcPr>
+            <w:tcW w:type="dxa" w:w="3009"/>
+            <w:shd w:fill="DDEBF7"/>
+            <w:vAlign w:val="center"/>
+          </w:tcPr>
+          <w:p>
+            <w:r>
+              <w:rPr>
+                <w:b/>
+              </w:rPr>
+              <w:t>Cantidad</w:t>
+            </w:r>
+          </w:p>
+        </w:tc>
+        <w:tc>
+          <w:tcPr>
+            <w:tcW w:type="dxa" w:w="3009"/>
+            <w:shd w:fill="DDEBF7"/>
+            <w:vAlign w:val="center"/>
+          </w:tcPr>
+          <w:p>
+            <w:r>
+              <w:rPr>
+                <w:b/>
+              </w:rPr>
+              <w:t>Cobertura principal</w:t>
+            </w:r>
+          </w:p>
+        </w:tc>
+      </w:tr>
+      <w:tr>
+        <w:tc>
+          <w:tcPr>
+            <w:tcW w:type="dxa" w:w="3009"/>
+            <w:vAlign w:val="top"/>
+          </w:tcPr>
+          <w:p>
+            <w:r>
+              <w:t>Página principal</w:t>
+            </w:r>
+          </w:p>
+        </w:tc>
+        <w:tc>
+          <w:tcPr>
+            <w:tcW w:type="dxa" w:w="3009"/>
+            <w:vAlign w:val="top"/>
+          </w:tcPr>
+          <w:p>
+            <w:r>
+              <w:t>1</w:t>
+            </w:r>
+          </w:p>
+        </w:tc>
+        <w:tc>
+          <w:tcPr>
+            <w:tcW w:type="dxa" w:w="3009"/>
+            <w:vAlign w:val="top"/>
+          </w:tcPr>
+          <w:p>
+            <w:r>
+              <w:t>Respuesta HTTP y elementos del dashboard.</w:t>
+            </w:r>
+          </w:p>
+        </w:tc>
+      </w:tr>
+      <w:tr>
+        <w:tc>
+          <w:tcPr>
+            <w:tcW w:type="dxa" w:w="3009"/>
+            <w:vAlign w:val="top"/>
+          </w:tcPr>
+          <w:p>
+            <w:r>
+              <w:t>Modelos y validaciones</w:t>
+            </w:r>
+          </w:p>
+        </w:tc>
+        <w:tc>
+          <w:tcPr>
+            <w:tcW w:type="dxa" w:w="3009"/>
+            <w:vAlign w:val="top"/>
+          </w:tcPr>
+          <w:p>
+            <w:r>
+              <w:t>3</w:t>
+            </w:r>
+          </w:p>
+        </w:tc>
+        <w:tc>
+          <w:tcPr>
+            <w:tcW w:type="dxa" w:w="3009"/>
+            <w:vAlign w:val="top"/>
+          </w:tcPr>
+          <w:p>
+            <w:r>
+              <w:t>Relaciones, horario duplicado y solapamiento parcial.</w:t>
+            </w:r>
+          </w:p>
+        </w:tc>
+      </w:tr>
+      <w:tr>
+        <w:tc>
+          <w:tcPr>
+            <w:tcW w:type="dxa" w:w="3009"/>
+            <w:vAlign w:val="top"/>
+          </w:tcPr>
+          <w:p>
+            <w:r>
+              <w:t>Flujo web y configuración</w:t>
+            </w:r>
+          </w:p>
+        </w:tc>
+        <w:tc>
+          <w:tcPr>
+            <w:tcW w:type="dxa" w:w="3009"/>
+            <w:vAlign w:val="top"/>
+          </w:tcPr>
+          <w:p>
+            <w:r>
+              <w:t>7</w:t>
+            </w:r>
+          </w:p>
+        </w:tc>
+        <w:tc>
+          <w:tcPr>
+            <w:tcW w:type="dxa" w:w="3009"/>
+            <w:vAlign w:val="top"/>
+          </w:tcPr>
+          <w:p>
+            <w:r>
+              <w:t>Registro, filtros, agenda diaria, roles, dashboard y rutas.</w:t>
+            </w:r>
+          </w:p>
+        </w:tc>
+      </w:tr>
+      <w:tr>
+        <w:tc>
+          <w:tcPr>
+            <w:tcW w:type="dxa" w:w="3009"/>
+            <w:vAlign w:val="top"/>
+          </w:tcPr>
+          <w:p>
+            <w:r>
+              <w:t>DAO, vistas y API</w:t>
+            </w:r>
+          </w:p>
+        </w:tc>
+        <w:tc>
+          <w:tcPr>
+            <w:tcW w:type="dxa" w:w="3009"/>
+            <w:vAlign w:val="top"/>
+          </w:tcPr>
+          <w:p>
+            <w:r>
+              <w:t>7</w:t>
+            </w:r>
+          </w:p>
+        </w:tc>
+        <w:tc>
+          <w:tcPr>
+            <w:tcW w:type="dxa" w:w="3009"/>
+            <w:vAlign w:val="top"/>
+          </w:tcPr>
+          <w:p>
+            <w:r>
+              <w:t>CRUD DAO, búsquedas, transiciones, JSON y delegación desde vistas.</w:t>
+            </w:r>
+          </w:p>
+        </w:tc>
+      </w:tr>
+      <w:tr>
+        <w:tc>
+          <w:tcPr>
+            <w:tcW w:type="dxa" w:w="3009"/>
+            <w:vAlign w:val="top"/>
+          </w:tcPr>
+          <w:p>
+            <w:r>
+              <w:t>Total</w:t>
+            </w:r>
+          </w:p>
+        </w:tc>
+        <w:tc>
+          <w:tcPr>
+            <w:tcW w:type="dxa" w:w="3009"/>
+            <w:vAlign w:val="top"/>
+          </w:tcPr>
+          <w:p>
+            <w:r>
+              <w:t>18</w:t>
+            </w:r>
+          </w:p>
+        </w:tc>
+        <w:tc>
+          <w:tcPr>
+            <w:tcW w:type="dxa" w:w="3009"/>
+            <w:vAlign w:val="top"/>
+          </w:tcPr>
+          <w:p>
+            <w:r>
+              <w:t>Resultado: OK.</w:t>
+            </w:r>
+          </w:p>
+        </w:tc>
+      </w:tr>
+    </w:tbl>
+    <w:p/>
+    <w:p>
+      <w:pPr>
+        <w:ind w:left="504" w:right="504"/>
+      </w:pPr>
+      <w:r>
+        <w:rPr>
+          <w:rFonts w:ascii="Courier New" w:hAnsi="Courier New"/>
+          <w:sz w:val="18"/>
+        </w:rPr>
+        <w:t>python3 manage.py check</w:t>
+        <w:br/>
+      </w:r>
+      <w:r>
+        <w:rPr>
+          <w:rFonts w:ascii="Courier New" w:hAnsi="Courier New"/>
+          <w:sz w:val="18"/>
+        </w:rPr>
+        <w:t>python3 manage.py makemigrations --check --dry-run</w:t>
+        <w:br/>
+      </w:r>
+      <w:r>
+        <w:rPr>
+          <w:rFonts w:ascii="Courier New" w:hAnsi="Courier New"/>
+          <w:sz w:val="18"/>
+        </w:rPr>
+        <w:t>python3 manage.py test -v 2</w:t>
+        <w:br/>
+      </w:r>
+    </w:p>
+    <w:p>
+      <w:r>
+        <w:rPr>
+          <w:rFonts w:ascii="Aptos" w:hAnsi="Aptos"/>
+          <w:sz w:val="21"/>
+        </w:rPr>
+        <w:t>Los resultados completos se encuentran en docs/resultados-pruebas-fase4.txt. No se detectaron problemas de configuración ni migraciones pendientes.</w:t>
+      </w:r>
+    </w:p>
+    <w:p>
+      <w:pPr>
+        <w:pStyle w:val="Heading2"/>
+      </w:pPr>
+      <w:r>
+        <w:rPr>
+          <w:rFonts w:ascii="Aptos" w:hAnsi="Aptos"/>
+        </w:rPr>
+        <w:t>4.9 Evidencias visuales</w:t>
+      </w:r>
+    </w:p>
+    <w:p>
+      <w:pPr>
+        <w:pStyle w:val="Heading3"/>
+      </w:pPr>
+      <w:r>
+        <w:rPr>
+          <w:rFonts w:ascii="Aptos" w:hAnsi="Aptos"/>
+        </w:rPr>
+        <w:t>4.9.1 Agenda obtenida mediante DAO</w:t>
+      </w:r>
+    </w:p>
     <w:p>
       <w:pPr>
         <w:jc w:val="center"/>
@@ -6462,7 +7469,27 @@
           <w:color w:val="595959"/>
           <w:sz w:val="18"/>
         </w:rPr>
-        <w:t>Figura 2. Agenda con una cita confirmada y acciones permitidas.</w:t>
+        <w:t>Figura 2. Agenda diaria con botones de estado.</w:t>
+      </w:r>
+    </w:p>
+    <w:p>
+      <w:r>
+        <w:rPr>
+          <w:rFonts w:ascii="Aptos" w:hAnsi="Aptos"/>
+          <w:sz w:val="21"/>
+        </w:rPr>
+        <w:t>La interfaz identifica la arquitectura de la fase 4, muestra una cita confirmada y ofrece las acciones permitidas.</w:t>
+      </w:r>
+    </w:p>
+    <w:p>
+      <w:pPr>
+        <w:pStyle w:val="Heading3"/>
+      </w:pPr>
+      <w:r>
+        <w:rPr>
+          <w:rFonts w:ascii="Aptos" w:hAnsi="Aptos"/>
+        </w:rPr>
+        <w:t>4.9.2 Cambio de estado aplicado</w:t>
       </w:r>
     </w:p>
     <w:p>
@@ -6519,56 +7546,27 @@
           <w:color w:val="595959"/>
           <w:sz w:val="18"/>
         </w:rPr>
-        <w:t>Figura 3. Resultado de cambiar la cita a estado atendida mediante el DAO.</w:t>
-      </w:r>
-    </w:p>
-    <w:p>
-      <w:pPr>
-        <w:pStyle w:val="Heading2"/>
-      </w:pPr>
-      <w:r>
-        <w:rPr>
-          <w:rFonts w:ascii="Aptos" w:hAnsi="Aptos"/>
-        </w:rPr>
-        <w:t>4.5 Endpoint REST</w:t>
-      </w:r>
-    </w:p>
-    <w:p>
-      <w:r>
-        <w:rPr>
-          <w:rFonts w:ascii="Aptos" w:hAnsi="Aptos"/>
-          <w:sz w:val="21"/>
-        </w:rPr>
-        <w:t>El endpoint GET /api/citas/activas/ utiliza CitasActivasAPIView, CitaDAO.listar_activas() y CitaSerializer. Devuelve únicamente citas solicitadas o confirmadas e incluye los datos relacionados de mascota, propietario y veterinario.</w:t>
-      </w:r>
-    </w:p>
-    <w:p>
-      <w:pPr>
-        <w:ind w:left="504" w:right="504"/>
-      </w:pPr>
-      <w:r>
-        <w:rPr>
-          <w:rFonts w:ascii="Courier New" w:hAnsi="Courier New"/>
-          <w:sz w:val="18"/>
-        </w:rPr>
-        <w:t>GET /api/citas/activas/</w:t>
-        <w:br/>
-      </w:r>
-      <w:r>
-        <w:rPr>
-          <w:rFonts w:ascii="Courier New" w:hAnsi="Courier New"/>
-          <w:sz w:val="18"/>
-        </w:rPr>
-        <w:t>HTTP 200 OK</w:t>
-        <w:br/>
-      </w:r>
-      <w:r>
-        <w:rPr>
-          <w:rFonts w:ascii="Courier New" w:hAnsi="Courier New"/>
-          <w:sz w:val="18"/>
-        </w:rPr>
-        <w:t>Content-Type: application/json</w:t>
-        <w:br/>
+        <w:t>Figura 3. Cita actualizada a atendida mediante el DAO.</w:t>
+      </w:r>
+    </w:p>
+    <w:p>
+      <w:r>
+        <w:rPr>
+          <w:rFonts w:ascii="Aptos" w:hAnsi="Aptos"/>
+          <w:sz w:val="21"/>
+        </w:rPr>
+        <w:t>Después de ejecutar Marcar atendida, el backend muestra la confirmación, actualiza la etiqueta y elimina las acciones que ya no corresponden.</w:t>
+      </w:r>
+    </w:p>
+    <w:p>
+      <w:pPr>
+        <w:pStyle w:val="Heading3"/>
+      </w:pPr>
+      <w:r>
+        <w:rPr>
+          <w:rFonts w:ascii="Aptos" w:hAnsi="Aptos"/>
+        </w:rPr>
+        <w:t>4.9.3 Respuesta JSON del backend</w:t>
       </w:r>
     </w:p>
     <w:p>
@@ -6625,7 +7623,16 @@
           <w:color w:val="595959"/>
           <w:sz w:val="18"/>
         </w:rPr>
-        <w:t>Figura 4. Endpoint REST de citas activas con respuesta HTTP 200.</w:t>
+        <w:t>Figura 4. Endpoint de citas activas con respuesta HTTP 200.</w:t>
+      </w:r>
+    </w:p>
+    <w:p>
+      <w:r>
+        <w:rPr>
+          <w:rFonts w:ascii="Aptos" w:hAnsi="Aptos"/>
+          <w:sz w:val="21"/>
+        </w:rPr>
+        <w:t>El endpoint respondió HTTP 200 OK y entregó una lista JSON de citas activas.</w:t>
       </w:r>
     </w:p>
     <w:p>
@@ -6636,253 +7643,9 @@
         <w:rPr>
           <w:rFonts w:ascii="Aptos" w:hAnsi="Aptos"/>
         </w:rPr>
-        <w:t>4.6 Pruebas de humo y de integración</w:t>
-      </w:r>
-    </w:p>
-    <w:p>
-      <w:r>
-        <w:rPr>
-          <w:rFonts w:ascii="Aptos" w:hAnsi="Aptos"/>
-          <w:sz w:val="21"/>
-        </w:rPr>
-        <w:t>La suite final contiene 18 pruebas. Las siete pruebas agregadas en la fase 4 cubren el CRUD del DAO, consultas con relaciones, transiciones válidas e inválidas, respuesta JSON y la delegación de las vistas al DAO mediante mocks.</w:t>
-      </w:r>
-    </w:p>
-    <w:tbl>
-      <w:tblPr>
-        <w:tblW w:type="auto" w:w="0"/>
-        <w:jc w:val="center"/>
-        <w:tblLook w:firstColumn="1" w:firstRow="1" w:lastColumn="0" w:lastRow="0" w:noHBand="0" w:noVBand="1" w:val="04A0"/>
-      </w:tblPr>
-      <w:tblGrid>
-        <w:gridCol w:w="3009"/>
-        <w:gridCol w:w="3009"/>
-        <w:gridCol w:w="3009"/>
-      </w:tblGrid>
-      <w:tr>
-        <w:tc>
-          <w:tcPr>
-            <w:tcW w:type="dxa" w:w="3009"/>
-            <w:shd w:fill="DDEBF7"/>
-            <w:vAlign w:val="center"/>
-          </w:tcPr>
-          <w:p>
-            <w:r>
-              <w:rPr>
-                <w:b/>
-              </w:rPr>
-              <w:t>Grupo de pruebas</w:t>
-            </w:r>
-          </w:p>
-        </w:tc>
-        <w:tc>
-          <w:tcPr>
-            <w:tcW w:type="dxa" w:w="3009"/>
-            <w:shd w:fill="DDEBF7"/>
-            <w:vAlign w:val="center"/>
-          </w:tcPr>
-          <w:p>
-            <w:r>
-              <w:rPr>
-                <w:b/>
-              </w:rPr>
-              <w:t>Cantidad</w:t>
-            </w:r>
-          </w:p>
-        </w:tc>
-        <w:tc>
-          <w:tcPr>
-            <w:tcW w:type="dxa" w:w="3009"/>
-            <w:shd w:fill="DDEBF7"/>
-            <w:vAlign w:val="center"/>
-          </w:tcPr>
-          <w:p>
-            <w:r>
-              <w:rPr>
-                <w:b/>
-              </w:rPr>
-              <w:t>Resultado</w:t>
-            </w:r>
-          </w:p>
-        </w:tc>
-      </w:tr>
-      <w:tr>
-        <w:tc>
-          <w:tcPr>
-            <w:tcW w:type="dxa" w:w="3009"/>
-            <w:vAlign w:val="top"/>
-          </w:tcPr>
-          <w:p>
-            <w:r>
-              <w:t>Página principal</w:t>
-            </w:r>
-          </w:p>
-        </w:tc>
-        <w:tc>
-          <w:tcPr>
-            <w:tcW w:type="dxa" w:w="3009"/>
-            <w:vAlign w:val="top"/>
-          </w:tcPr>
-          <w:p>
-            <w:r>
-              <w:t>1</w:t>
-            </w:r>
-          </w:p>
-        </w:tc>
-        <w:tc>
-          <w:tcPr>
-            <w:tcW w:type="dxa" w:w="3009"/>
-            <w:vAlign w:val="top"/>
-          </w:tcPr>
-          <w:p>
-            <w:r>
-              <w:t>Aprobada.</w:t>
-            </w:r>
-          </w:p>
-        </w:tc>
-      </w:tr>
-      <w:tr>
-        <w:tc>
-          <w:tcPr>
-            <w:tcW w:type="dxa" w:w="3009"/>
-            <w:vAlign w:val="top"/>
-          </w:tcPr>
-          <w:p>
-            <w:r>
-              <w:t>Modelos y validaciones de horarios</w:t>
-            </w:r>
-          </w:p>
-        </w:tc>
-        <w:tc>
-          <w:tcPr>
-            <w:tcW w:type="dxa" w:w="3009"/>
-            <w:vAlign w:val="top"/>
-          </w:tcPr>
-          <w:p>
-            <w:r>
-              <w:t>3</w:t>
-            </w:r>
-          </w:p>
-        </w:tc>
-        <w:tc>
-          <w:tcPr>
-            <w:tcW w:type="dxa" w:w="3009"/>
-            <w:vAlign w:val="top"/>
-          </w:tcPr>
-          <w:p>
-            <w:r>
-              <w:t>Aprobadas.</w:t>
-            </w:r>
-          </w:p>
-        </w:tc>
-      </w:tr>
-      <w:tr>
-        <w:tc>
-          <w:tcPr>
-            <w:tcW w:type="dxa" w:w="3009"/>
-            <w:vAlign w:val="top"/>
-          </w:tcPr>
-          <w:p>
-            <w:r>
-              <w:t>Flujo web, agenda, dashboard y roles</w:t>
-            </w:r>
-          </w:p>
-        </w:tc>
-        <w:tc>
-          <w:tcPr>
-            <w:tcW w:type="dxa" w:w="3009"/>
-            <w:vAlign w:val="top"/>
-          </w:tcPr>
-          <w:p>
-            <w:r>
-              <w:t>7</w:t>
-            </w:r>
-          </w:p>
-        </w:tc>
-        <w:tc>
-          <w:tcPr>
-            <w:tcW w:type="dxa" w:w="3009"/>
-            <w:vAlign w:val="top"/>
-          </w:tcPr>
-          <w:p>
-            <w:r>
-              <w:t>Aprobadas.</w:t>
-            </w:r>
-          </w:p>
-        </w:tc>
-      </w:tr>
-      <w:tr>
-        <w:tc>
-          <w:tcPr>
-            <w:tcW w:type="dxa" w:w="3009"/>
-            <w:vAlign w:val="top"/>
-          </w:tcPr>
-          <w:p>
-            <w:r>
-              <w:t>DAO, vistas y endpoint REST</w:t>
-            </w:r>
-          </w:p>
-        </w:tc>
-        <w:tc>
-          <w:tcPr>
-            <w:tcW w:type="dxa" w:w="3009"/>
-            <w:vAlign w:val="top"/>
-          </w:tcPr>
-          <w:p>
-            <w:r>
-              <w:t>7</w:t>
-            </w:r>
-          </w:p>
-        </w:tc>
-        <w:tc>
-          <w:tcPr>
-            <w:tcW w:type="dxa" w:w="3009"/>
-            <w:vAlign w:val="top"/>
-          </w:tcPr>
-          <w:p>
-            <w:r>
-              <w:t>Aprobadas.</w:t>
-            </w:r>
-          </w:p>
-        </w:tc>
-      </w:tr>
-      <w:tr>
-        <w:tc>
-          <w:tcPr>
-            <w:tcW w:type="dxa" w:w="3009"/>
-            <w:vAlign w:val="top"/>
-          </w:tcPr>
-          <w:p>
-            <w:r>
-              <w:t>Total</w:t>
-            </w:r>
-          </w:p>
-        </w:tc>
-        <w:tc>
-          <w:tcPr>
-            <w:tcW w:type="dxa" w:w="3009"/>
-            <w:vAlign w:val="top"/>
-          </w:tcPr>
-          <w:p>
-            <w:r>
-              <w:t>18</w:t>
-            </w:r>
-          </w:p>
-        </w:tc>
-        <w:tc>
-          <w:tcPr>
-            <w:tcW w:type="dxa" w:w="3009"/>
-            <w:vAlign w:val="top"/>
-          </w:tcPr>
-          <w:p>
-            <w:r>
-              <w:t>OK, sin errores.</w:t>
-            </w:r>
-          </w:p>
-        </w:tc>
-      </w:tr>
-    </w:tbl>
-    <w:p/>
+        <w:t>4.10 Procedimiento de reproducción</w:t>
+      </w:r>
+    </w:p>
     <w:p>
       <w:pPr>
         <w:ind w:left="504" w:right="504"/>
@@ -6892,7 +7655,7 @@
           <w:rFonts w:ascii="Courier New" w:hAnsi="Courier New"/>
           <w:sz w:val="18"/>
         </w:rPr>
-        <w:t>python3 manage.py check</w:t>
+        <w:t>git clone https://github.com/anaflrs4/vetagenda-aplicaciones-web-ii.git</w:t>
         <w:br/>
       </w:r>
       <w:r>
@@ -6900,7 +7663,7 @@
           <w:rFonts w:ascii="Courier New" w:hAnsi="Courier New"/>
           <w:sz w:val="18"/>
         </w:rPr>
-        <w:t>python3 manage.py makemigrations --check --dry-run</w:t>
+        <w:t>cd vetagenda-aplicaciones-web-ii</w:t>
         <w:br/>
       </w:r>
       <w:r>
@@ -6908,7 +7671,7 @@
           <w:rFonts w:ascii="Courier New" w:hAnsi="Courier New"/>
           <w:sz w:val="18"/>
         </w:rPr>
-        <w:t>python3 manage.py test -v 2</w:t>
+        <w:t>python3 -m venv .venv</w:t>
         <w:br/>
       </w:r>
       <w:r>
@@ -6916,6 +7679,7 @@
           <w:rFonts w:ascii="Courier New" w:hAnsi="Courier New"/>
           <w:sz w:val="18"/>
         </w:rPr>
+        <w:t>source .venv/bin/activate    # Windows: .venv\Scripts\activate</w:t>
         <w:br/>
       </w:r>
       <w:r>
@@ -6923,9 +7687,58 @@
           <w:rFonts w:ascii="Courier New" w:hAnsi="Courier New"/>
           <w:sz w:val="18"/>
         </w:rPr>
-        <w:t>Resultado: Found 18 test(s). Ran 18 tests. OK.</w:t>
+        <w:t>pip install -r requirements.txt</w:t>
         <w:br/>
       </w:r>
+      <w:r>
+        <w:rPr>
+          <w:rFonts w:ascii="Courier New" w:hAnsi="Courier New"/>
+          <w:sz w:val="18"/>
+        </w:rPr>
+        <w:t>python3 manage.py migrate</w:t>
+        <w:br/>
+      </w:r>
+      <w:r>
+        <w:rPr>
+          <w:rFonts w:ascii="Courier New" w:hAnsi="Courier New"/>
+          <w:sz w:val="18"/>
+        </w:rPr>
+        <w:t>python3 manage.py configurar_roles</w:t>
+        <w:br/>
+      </w:r>
+      <w:r>
+        <w:rPr>
+          <w:rFonts w:ascii="Courier New" w:hAnsi="Courier New"/>
+          <w:sz w:val="18"/>
+        </w:rPr>
+        <w:t>python3 manage.py cargar_demo</w:t>
+        <w:br/>
+      </w:r>
+      <w:r>
+        <w:rPr>
+          <w:rFonts w:ascii="Courier New" w:hAnsi="Courier New"/>
+          <w:sz w:val="18"/>
+        </w:rPr>
+        <w:t>python3 manage.py test</w:t>
+        <w:br/>
+      </w:r>
+      <w:r>
+        <w:rPr>
+          <w:rFonts w:ascii="Courier New" w:hAnsi="Courier New"/>
+          <w:sz w:val="18"/>
+        </w:rPr>
+        <w:t>python3 manage.py runserver</w:t>
+        <w:br/>
+      </w:r>
+    </w:p>
+    <w:p>
+      <w:r>
+        <w:rPr>
+          <w:rFonts w:ascii="Aptos" w:hAnsi="Aptos"/>
+          <w:sz w:val="21"/>
+        </w:rPr>
+        <w:t>Después de iniciar el servidor se pueden revisar /citas/, /citas/hoy/ y /api/citas/activas/.</w:t>
+      </w:r>
     </w:p>
     <w:p>
       <w:pPr>
@@ -6935,7 +7748,27 @@
         <w:rPr>
           <w:rFonts w:ascii="Aptos" w:hAnsi="Aptos"/>
         </w:rPr>
-        <w:t>4.7 Evidencias y ubicación en el repositorio</w:t>
+        <w:t>4.11 Resultado de la fase</w:t>
+      </w:r>
+    </w:p>
+    <w:p>
+      <w:r>
+        <w:rPr>
+          <w:rFonts w:ascii="Aptos" w:hAnsi="Aptos"/>
+          <w:sz w:val="21"/>
+        </w:rPr>
+        <w:t>VetAgenda cumple el objetivo técnico señalado por la retroalimentación: las vistas ya no acceden directamente al ORM. El backend cuenta con una capa DAO reutilizable y comprobada; el frontend puede consultar citas y cambiar estados; el endpoint REST responde en JSON; y las pruebas demuestran la creación, consulta, actualización y coordinación de las capas. La arquitectura resultante mejora la separación de responsabilidades y facilita que nuevas interfaces utilicen las mismas operaciones de datos.</w:t>
+      </w:r>
+    </w:p>
+    <w:p>
+      <w:pPr>
+        <w:pStyle w:val="Heading2"/>
+      </w:pPr>
+      <w:r>
+        <w:rPr>
+          <w:rFonts w:ascii="Aptos" w:hAnsi="Aptos"/>
+        </w:rPr>
+        <w:t>4.12 Evidencias y ubicación en el repositorio</w:t>
       </w:r>
     </w:p>
     <w:tbl>
@@ -7175,123 +8008,7 @@
         <w:rPr>
           <w:rFonts w:ascii="Aptos" w:hAnsi="Aptos"/>
         </w:rPr>
-        <w:t>4.8 Procedimiento de reproducción</w:t>
-      </w:r>
-    </w:p>
-    <w:p>
-      <w:pPr>
-        <w:ind w:left="504" w:right="504"/>
-      </w:pPr>
-      <w:r>
-        <w:rPr>
-          <w:rFonts w:ascii="Courier New" w:hAnsi="Courier New"/>
-          <w:sz w:val="18"/>
-        </w:rPr>
-        <w:t>git clone https://github.com/anaflrs4/vetagenda-aplicaciones-web-ii.git</w:t>
-        <w:br/>
-      </w:r>
-      <w:r>
-        <w:rPr>
-          <w:rFonts w:ascii="Courier New" w:hAnsi="Courier New"/>
-          <w:sz w:val="18"/>
-        </w:rPr>
-        <w:t>cd vetagenda-aplicaciones-web-ii</w:t>
-        <w:br/>
-      </w:r>
-      <w:r>
-        <w:rPr>
-          <w:rFonts w:ascii="Courier New" w:hAnsi="Courier New"/>
-          <w:sz w:val="18"/>
-        </w:rPr>
-        <w:t>python3 -m venv .venv</w:t>
-        <w:br/>
-      </w:r>
-      <w:r>
-        <w:rPr>
-          <w:rFonts w:ascii="Courier New" w:hAnsi="Courier New"/>
-          <w:sz w:val="18"/>
-        </w:rPr>
-        <w:t>source .venv/bin/activate    # Windows: .venv\Scripts\activate</w:t>
-        <w:br/>
-      </w:r>
-      <w:r>
-        <w:rPr>
-          <w:rFonts w:ascii="Courier New" w:hAnsi="Courier New"/>
-          <w:sz w:val="18"/>
-        </w:rPr>
-        <w:t>pip install -r requirements.txt</w:t>
-        <w:br/>
-      </w:r>
-      <w:r>
-        <w:rPr>
-          <w:rFonts w:ascii="Courier New" w:hAnsi="Courier New"/>
-          <w:sz w:val="18"/>
-        </w:rPr>
-        <w:t>python3 manage.py migrate</w:t>
-        <w:br/>
-      </w:r>
-      <w:r>
-        <w:rPr>
-          <w:rFonts w:ascii="Courier New" w:hAnsi="Courier New"/>
-          <w:sz w:val="18"/>
-        </w:rPr>
-        <w:t>python3 manage.py configurar_roles</w:t>
-        <w:br/>
-      </w:r>
-      <w:r>
-        <w:rPr>
-          <w:rFonts w:ascii="Courier New" w:hAnsi="Courier New"/>
-          <w:sz w:val="18"/>
-        </w:rPr>
-        <w:t>python3 manage.py cargar_demo</w:t>
-        <w:br/>
-      </w:r>
-      <w:r>
-        <w:rPr>
-          <w:rFonts w:ascii="Courier New" w:hAnsi="Courier New"/>
-          <w:sz w:val="18"/>
-        </w:rPr>
-        <w:t>python3 manage.py test</w:t>
-        <w:br/>
-      </w:r>
-      <w:r>
-        <w:rPr>
-          <w:rFonts w:ascii="Courier New" w:hAnsi="Courier New"/>
-          <w:sz w:val="18"/>
-        </w:rPr>
-        <w:t>python3 manage.py runserver</w:t>
-        <w:br/>
-      </w:r>
-    </w:p>
-    <w:p>
-      <w:pPr>
-        <w:pStyle w:val="Heading2"/>
-      </w:pPr>
-      <w:r>
-        <w:rPr>
-          <w:rFonts w:ascii="Aptos" w:hAnsi="Aptos"/>
-        </w:rPr>
-        <w:t>4.9 Conclusión de la fase</w:t>
-      </w:r>
-    </w:p>
-    <w:p>
-      <w:r>
-        <w:rPr>
-          <w:rFonts w:ascii="Aptos" w:hAnsi="Aptos"/>
-          <w:sz w:val="21"/>
-        </w:rPr>
-        <w:t>La fase 4 atiende el principal aspecto señalado por la docente: VetAgenda utiliza ahora una capa DAO real entre las vistas y el ORM. Las consultas y operaciones CRUD se encuentran centralizadas, el frontend permite cambiar estados mediante el backend y el endpoint REST entrega datos en JSON. Las 18 pruebas aprobadas demuestran tanto el comportamiento funcional como la delegación efectiva de las vistas al DAO.</w:t>
-      </w:r>
-    </w:p>
-    <w:p>
-      <w:pPr>
-        <w:pStyle w:val="Heading2"/>
-      </w:pPr>
-      <w:r>
-        <w:rPr>
-          <w:rFonts w:ascii="Aptos" w:hAnsi="Aptos"/>
-        </w:rPr>
-        <w:t>Fuentes específicas de la fase 4</w:t>
+        <w:t>4.13 Referencias</w:t>
       </w:r>
     </w:p>
     <w:p>

</xml_diff>